<commit_message>
feat: atualizar curriculo com projetos detalhados, link OdontoVieira e resumo conciso do Batatoom
</commit_message>
<xml_diff>
--- a/public/Curriculo-Julio-Santos.docx
+++ b/public/Curriculo-Julio-Santos.docx
@@ -4,629 +4,569 @@
   <w:body>
     <w:p>
       <w:pPr>
-        <w:spacing w:before="0" w:after="40"/>
+        <w:spacing w:after="40" w:line="276" w:lineRule="auto"/>
         <w:jc w:val="center"/>
       </w:pPr>
       <w:r>
         <w:rPr>
-          <w:rFonts w:ascii="Arial" w:hAnsi="Arial"/>
+          <w:rFonts w:ascii="Calibri" w:hAnsi="Calibri"/>
           <w:b/>
-          <w:color w:val="5B21B6"/>
-          <w:sz w:val="44"/>
+          <w:color w:val="3730A3"/>
+          <w:sz w:val="36"/>
         </w:rPr>
         <w:t>Júlio Santos</w:t>
       </w:r>
     </w:p>
     <w:p>
       <w:pPr>
-        <w:spacing w:before="0" w:after="120"/>
+        <w:spacing w:after="40" w:line="276" w:lineRule="auto"/>
         <w:jc w:val="center"/>
       </w:pPr>
       <w:r>
         <w:rPr>
-          <w:rFonts w:ascii="Arial" w:hAnsi="Arial"/>
+          <w:rFonts w:ascii="Calibri" w:hAnsi="Calibri"/>
           <w:b/>
-          <w:color w:val="78716C"/>
-          <w:sz w:val="26"/>
+          <w:color w:val="1F2937"/>
+          <w:sz w:val="22"/>
         </w:rPr>
         <w:t>Desenvolvedor Full Stack &amp; DevOps</w:t>
       </w:r>
     </w:p>
     <w:p>
       <w:pPr>
-        <w:spacing w:before="0" w:after="360"/>
+        <w:spacing w:after="160" w:line="276" w:lineRule="auto"/>
         <w:jc w:val="center"/>
       </w:pPr>
       <w:r>
         <w:rPr>
-          <w:rFonts w:ascii="Arial" w:hAnsi="Arial"/>
-          <w:color w:val="1C1917"/>
-          <w:sz w:val="19"/>
+          <w:rFonts w:ascii="Calibri" w:hAnsi="Calibri"/>
+          <w:b w:val="0"/>
+          <w:color w:val="4B5563"/>
+          <w:sz w:val="18"/>
         </w:rPr>
-        <w:t>Paulista, PE — Brasil  |  (81) 98660-1822  |  juliorasantos@gmail.com</w:t>
+        <w:t>Paulista, PE — Brasil | (81) 98660-1822 | juliorasantos@gmail.com</w:t>
         <w:br/>
-        <w:t>linkedin.com/in/juliorasantos  |  github.com/Shuralot</w:t>
+        <w:t>linkedin.com/in/juliorasantos | github.com/Shuralot</w:t>
       </w:r>
     </w:p>
     <w:p>
       <w:pPr>
-        <w:keepNext/>
-        <w:pBdr>
-          <w:bottom w:val="single" w:sz="6" w:space="4" w:color="E7E5E4"/>
-        </w:pBdr>
-        <w:spacing w:before="240" w:after="160"/>
+        <w:spacing w:after="60" w:line="276" w:lineRule="auto"/>
+        <w:jc w:val="left"/>
       </w:pPr>
       <w:r>
         <w:rPr>
-          <w:rFonts w:ascii="Arial" w:hAnsi="Arial"/>
+          <w:rFonts w:ascii="Calibri" w:hAnsi="Calibri"/>
           <w:b/>
-          <w:color w:val="5B21B6"/>
-          <w:sz w:val="24"/>
+          <w:color w:val="3730A3"/>
+          <w:sz w:val="22"/>
         </w:rPr>
         <w:t>Resumo Profissional</w:t>
       </w:r>
     </w:p>
     <w:p>
       <w:pPr>
-        <w:spacing w:before="0" w:after="240"/>
+        <w:spacing w:after="120" w:line="276" w:lineRule="auto"/>
+        <w:jc w:val="left"/>
       </w:pPr>
       <w:r>
         <w:rPr>
-          <w:rFonts w:ascii="Arial" w:hAnsi="Arial"/>
-          <w:color w:val="1C1917"/>
-          <w:sz w:val="20"/>
+          <w:rFonts w:ascii="Calibri" w:hAnsi="Calibri"/>
+          <w:b w:val="0"/>
+          <w:color w:val="1F2937"/>
+          <w:sz w:val="19"/>
         </w:rPr>
-        <w:t>Engenheiro de Software com foco em desenvolvimento Full Stack e especialização em DevOps. Possuo uma trajetória única que combina graduação em Análise e Desenvolvimento de Sistemas, pós-graduação pela renomada CESAR School e bacharelado em Psicologia. Essa intersecção me permite ir além das linhas de código: aplico escuta ativa clínica para entender dores de negócio, facilito a comunicação interna e resolvo gargalos em metodologias ágeis, enquanto implemento arquiteturas escaláveis, orquestração de contêineres e automações robustas. Focado em otimizar o ciclo de desenvolvimento de software (SDLC) e aproximar a engenharia dos objetivos humanos e comerciais da empresa.</w:t>
+        <w:t>Engenheiro de Software com foco em desenvolvimento Full Stack e especialização em DevOps. Trajetória única que une graduação em Análise e Desenvolvimento de Sistemas, especialização pela CESAR School e bacharelado em Psicologia. Essa combinação me capacita a aplicar escuta ativa clínica para mapear necessidades de negócio reais, alinhar comunicação em times ágeis e implementar arquiteturas escaláveis com contêineres Docker, APIs performáticas e automações robustas.</w:t>
       </w:r>
     </w:p>
     <w:p>
       <w:pPr>
-        <w:keepNext/>
-        <w:pBdr>
-          <w:bottom w:val="single" w:sz="6" w:space="4" w:color="E7E5E4"/>
-        </w:pBdr>
-        <w:spacing w:before="240" w:after="160"/>
+        <w:spacing w:after="60" w:line="276" w:lineRule="auto"/>
+        <w:jc w:val="left"/>
       </w:pPr>
       <w:r>
         <w:rPr>
-          <w:rFonts w:ascii="Arial" w:hAnsi="Arial"/>
+          <w:rFonts w:ascii="Calibri" w:hAnsi="Calibri"/>
           <w:b/>
-          <w:color w:val="5B21B6"/>
-          <w:sz w:val="24"/>
+          <w:color w:val="3730A3"/>
+          <w:sz w:val="22"/>
         </w:rPr>
         <w:t>Áreas de Especialidade</w:t>
       </w:r>
     </w:p>
     <w:p>
       <w:pPr>
-        <w:pStyle w:val="ListBullet"/>
-        <w:spacing w:before="0" w:after="60"/>
+        <w:spacing w:after="40" w:line="276" w:lineRule="auto"/>
+        <w:jc w:val="left"/>
       </w:pPr>
       <w:r>
         <w:rPr>
-          <w:rFonts w:ascii="Arial" w:hAnsi="Arial"/>
-          <w:b/>
-          <w:color w:val="1C1917"/>
-          <w:sz w:val="20"/>
+          <w:rFonts w:ascii="Calibri" w:hAnsi="Calibri"/>
+          <w:b w:val="0"/>
+          <w:color w:val="1F2937"/>
+          <w:sz w:val="19"/>
         </w:rPr>
-        <w:t xml:space="preserve">Front-end: </w:t>
-      </w:r>
-      <w:r>
-        <w:rPr>
-          <w:rFonts w:ascii="Arial" w:hAnsi="Arial"/>
-          <w:color w:val="44403C"/>
-          <w:sz w:val="20"/>
-        </w:rPr>
-        <w:t>Next.js, React, Angular, TypeScript, JavaScript, HTML5/CSS3, Tailwind CSS, Bootstrap, Sass.</w:t>
+        <w:t>• Front-end: Next.js (App Router), React, TypeScript, JavaScript, HTML5/CSS3, Tailwind CSS, Angular, Bootstrap.</w:t>
       </w:r>
     </w:p>
     <w:p>
       <w:pPr>
-        <w:pStyle w:val="ListBullet"/>
-        <w:spacing w:before="0" w:after="60"/>
+        <w:spacing w:after="40" w:line="276" w:lineRule="auto"/>
+        <w:jc w:val="left"/>
       </w:pPr>
       <w:r>
         <w:rPr>
-          <w:rFonts w:ascii="Arial" w:hAnsi="Arial"/>
-          <w:b/>
-          <w:color w:val="1C1917"/>
-          <w:sz w:val="20"/>
+          <w:rFonts w:ascii="Calibri" w:hAnsi="Calibri"/>
+          <w:b w:val="0"/>
+          <w:color w:val="1F2937"/>
+          <w:sz w:val="19"/>
         </w:rPr>
-        <w:t xml:space="preserve">Back-end &amp; APIs: </w:t>
-      </w:r>
-      <w:r>
-        <w:rPr>
-          <w:rFonts w:ascii="Arial" w:hAnsi="Arial"/>
-          <w:color w:val="44403C"/>
-          <w:sz w:val="20"/>
-        </w:rPr>
-        <w:t>Node.js, Express, Python, Django, PyQt6 (Interface Gráfica Desktop), REST APIs.</w:t>
+        <w:t>• Back-end &amp; APIs: Node.js, Express, Python, Django, REST APIs, WebSockets (Socket.IO), PyQt6 Desktop.</w:t>
       </w:r>
     </w:p>
     <w:p>
       <w:pPr>
-        <w:pStyle w:val="ListBullet"/>
-        <w:spacing w:before="0" w:after="60"/>
+        <w:spacing w:after="40" w:line="276" w:lineRule="auto"/>
+        <w:jc w:val="left"/>
       </w:pPr>
       <w:r>
         <w:rPr>
-          <w:rFonts w:ascii="Arial" w:hAnsi="Arial"/>
-          <w:b/>
-          <w:color w:val="1C1917"/>
-          <w:sz w:val="20"/>
+          <w:rFonts w:ascii="Calibri" w:hAnsi="Calibri"/>
+          <w:b w:val="0"/>
+          <w:color w:val="1F2937"/>
+          <w:sz w:val="19"/>
         </w:rPr>
-        <w:t xml:space="preserve">DevOps &amp; Infraestrutura: </w:t>
-      </w:r>
-      <w:r>
-        <w:rPr>
-          <w:rFonts w:ascii="Arial" w:hAnsi="Arial"/>
-          <w:color w:val="44403C"/>
-          <w:sz w:val="20"/>
-        </w:rPr>
-        <w:t>Docker, Contêineres, Linux Red Hat (RH-124), Provisionamento VPS, Servidores Web, Integração Contínua (CI/CD).</w:t>
+        <w:t>• DevOps &amp; Infraestrutura: Docker, Contêineres, Linux Red Hat (RH-124), Provisionamento VPS, Web Servers, CI/CD, Cloudflare Tunnels.</w:t>
       </w:r>
     </w:p>
     <w:p>
       <w:pPr>
-        <w:pStyle w:val="ListBullet"/>
-        <w:spacing w:before="0" w:after="60"/>
+        <w:spacing w:after="40" w:line="276" w:lineRule="auto"/>
+        <w:jc w:val="left"/>
       </w:pPr>
       <w:r>
         <w:rPr>
-          <w:rFonts w:ascii="Arial" w:hAnsi="Arial"/>
-          <w:b/>
-          <w:color w:val="1C1917"/>
-          <w:sz w:val="20"/>
+          <w:rFonts w:ascii="Calibri" w:hAnsi="Calibri"/>
+          <w:b w:val="0"/>
+          <w:color w:val="1F2937"/>
+          <w:sz w:val="19"/>
         </w:rPr>
-        <w:t xml:space="preserve">Bancos &amp; Cloud: </w:t>
-      </w:r>
-      <w:r>
-        <w:rPr>
-          <w:rFonts w:ascii="Arial" w:hAnsi="Arial"/>
-          <w:color w:val="44403C"/>
-          <w:sz w:val="20"/>
-        </w:rPr>
-        <w:t>PostgreSQL, MySQL, Supabase, Firebase, Railway Deployments, Whitenoise serving.</w:t>
+        <w:t>• Bancos de Dados &amp; Cloud: PostgreSQL, MySQL, Prisma ORM, Firebase, Supabase, Railway Deployments.</w:t>
       </w:r>
     </w:p>
     <w:p>
       <w:pPr>
-        <w:pStyle w:val="ListBullet"/>
-        <w:spacing w:before="0" w:after="60"/>
+        <w:spacing w:after="120" w:line="276" w:lineRule="auto"/>
+        <w:jc w:val="left"/>
       </w:pPr>
       <w:r>
         <w:rPr>
-          <w:rFonts w:ascii="Arial" w:hAnsi="Arial"/>
-          <w:b/>
-          <w:color w:val="1C1917"/>
-          <w:sz w:val="20"/>
+          <w:rFonts w:ascii="Calibri" w:hAnsi="Calibri"/>
+          <w:b w:val="0"/>
+          <w:color w:val="1F2937"/>
+          <w:sz w:val="19"/>
         </w:rPr>
-        <w:t xml:space="preserve">Soft Skills: </w:t>
-      </w:r>
-      <w:r>
-        <w:rPr>
-          <w:rFonts w:ascii="Arial" w:hAnsi="Arial"/>
-          <w:color w:val="44403C"/>
-          <w:sz w:val="20"/>
-        </w:rPr>
-        <w:t>Comunicação Empática, Escuta Ativa, Resolução de Problemas, Scrum, Kanban, Git/GitHub.</w:t>
+        <w:t>• Metodologias &amp; Soft Skills: Escuta Ativa, Comunicação Empática, Resolução de Problemas, Scrum, Kanban, Git/GitHub.</w:t>
       </w:r>
     </w:p>
     <w:p>
       <w:pPr>
-        <w:keepNext/>
-        <w:pBdr>
-          <w:bottom w:val="single" w:sz="6" w:space="4" w:color="E7E5E4"/>
-        </w:pBdr>
-        <w:spacing w:before="240" w:after="160"/>
+        <w:spacing w:after="60" w:line="276" w:lineRule="auto"/>
+        <w:jc w:val="left"/>
       </w:pPr>
       <w:r>
         <w:rPr>
-          <w:rFonts w:ascii="Arial" w:hAnsi="Arial"/>
+          <w:rFonts w:ascii="Calibri" w:hAnsi="Calibri"/>
           <w:b/>
-          <w:color w:val="5B21B6"/>
-          <w:sz w:val="24"/>
+          <w:color w:val="3730A3"/>
+          <w:sz w:val="22"/>
+        </w:rPr>
+        <w:t>Projetos em Destaque</w:t>
+      </w:r>
+    </w:p>
+    <w:p>
+      <w:pPr>
+        <w:spacing w:after="40" w:line="276" w:lineRule="auto"/>
+        <w:jc w:val="left"/>
+      </w:pPr>
+      <w:r>
+        <w:rPr>
+          <w:rFonts w:ascii="Calibri" w:hAnsi="Calibri"/>
+          <w:b/>
+          <w:color w:val="1F2937"/>
+          <w:sz w:val="20"/>
+        </w:rPr>
+        <w:t>Batatoom! — Jogo Multiplayer em Tempo Real | github.com/Shuralot/Batatoom</w:t>
+      </w:r>
+    </w:p>
+    <w:p>
+      <w:pPr>
+        <w:spacing w:after="40" w:line="276" w:lineRule="auto"/>
+        <w:jc w:val="left"/>
+      </w:pPr>
+      <w:r>
+        <w:rPr>
+          <w:rFonts w:ascii="Calibri" w:hAnsi="Calibri"/>
+          <w:b w:val="0"/>
+          <w:color w:val="64748B"/>
+          <w:sz w:val="17"/>
+        </w:rPr>
+        <w:t>Stack: Node.js, Express, Socket.IO, WebSockets, Web Audio API, Cloudflare Tunnels</w:t>
+      </w:r>
+    </w:p>
+    <w:p>
+      <w:pPr>
+        <w:spacing w:after="40" w:line="276" w:lineRule="auto"/>
+        <w:jc w:val="left"/>
+      </w:pPr>
+      <w:r>
+        <w:rPr>
+          <w:rFonts w:ascii="Calibri" w:hAnsi="Calibri"/>
+          <w:b w:val="0"/>
+          <w:color w:val="1F2937"/>
+          <w:sz w:val="19"/>
+        </w:rPr>
+        <w:t>• Problema &amp; Solução: Party game multiplayer em tempo real de vocabulário e raciocínio ágil para navegadores, smartphones e Modo TV/Telão.</w:t>
+      </w:r>
+    </w:p>
+    <w:p>
+      <w:pPr>
+        <w:spacing w:after="40" w:line="276" w:lineRule="auto"/>
+        <w:jc w:val="left"/>
+      </w:pPr>
+      <w:r>
+        <w:rPr>
+          <w:rFonts w:ascii="Calibri" w:hAnsi="Calibri"/>
+          <w:b w:val="0"/>
+          <w:color w:val="1F2937"/>
+          <w:sz w:val="19"/>
+        </w:rPr>
+        <w:t>• Engenharia &amp; Decisões Técnicas: Arquitetura orientada a eventos com WebSockets; motor léxico em memória de +403.000 palavras em O(1) (&lt;1ms) via HashMaps e normalização Unicode NFD; áudio 100% procedural sintetizado via Web Audio API (0 KB de arquivos externos); servidor autoritativo com Máquina de Estados (FSM) contra trapaças e streaming de live typing; túneis Cloudflare e QR Code para entrada instantânea sem abertura de portas.</w:t>
+      </w:r>
+    </w:p>
+    <w:p>
+      <w:pPr>
+        <w:spacing w:after="80" w:line="276" w:lineRule="auto"/>
+        <w:jc w:val="left"/>
+      </w:pPr>
+      <w:r>
+        <w:rPr>
+          <w:rFonts w:ascii="Calibri" w:hAnsi="Calibri"/>
+          <w:b w:val="0"/>
+          <w:color w:val="1F2937"/>
+          <w:sz w:val="19"/>
+        </w:rPr>
+        <w:t>• Impacto: Sincronização multi-dispositivo fluida com latência imperceptível e zero atrito de instalação.</w:t>
+      </w:r>
+    </w:p>
+    <w:p>
+      <w:pPr>
+        <w:spacing w:after="40" w:line="276" w:lineRule="auto"/>
+        <w:jc w:val="left"/>
+      </w:pPr>
+      <w:r>
+        <w:rPr>
+          <w:rFonts w:ascii="Calibri" w:hAnsi="Calibri"/>
+          <w:b/>
+          <w:color w:val="1F2937"/>
+          <w:sz w:val="20"/>
+        </w:rPr>
+        <w:t>Website OdontoVieira — Plataforma Web &amp; SEO Local | clinicaodontovieira.com.br</w:t>
+      </w:r>
+    </w:p>
+    <w:p>
+      <w:pPr>
+        <w:spacing w:after="40" w:line="276" w:lineRule="auto"/>
+        <w:jc w:val="left"/>
+      </w:pPr>
+      <w:r>
+        <w:rPr>
+          <w:rFonts w:ascii="Calibri" w:hAnsi="Calibri"/>
+          <w:b w:val="0"/>
+          <w:color w:val="64748B"/>
+          <w:sz w:val="17"/>
+        </w:rPr>
+        <w:t>Stack: Next.js (App Router), React, TypeScript, Tailwind CSS, Google Tag Manager</w:t>
+      </w:r>
+    </w:p>
+    <w:p>
+      <w:pPr>
+        <w:spacing w:after="40" w:line="276" w:lineRule="auto"/>
+        <w:jc w:val="left"/>
+      </w:pPr>
+      <w:r>
+        <w:rPr>
+          <w:rFonts w:ascii="Calibri" w:hAnsi="Calibri"/>
+          <w:b w:val="0"/>
+          <w:color w:val="1F2937"/>
+          <w:sz w:val="19"/>
+        </w:rPr>
+        <w:t>• Problema &amp; Solução: Plataforma institucional de alta conversão e atração orgânica de pacientes para clínica odontológica.</w:t>
+      </w:r>
+    </w:p>
+    <w:p>
+      <w:pPr>
+        <w:spacing w:after="40" w:line="276" w:lineRule="auto"/>
+        <w:jc w:val="left"/>
+      </w:pPr>
+      <w:r>
+        <w:rPr>
+          <w:rFonts w:ascii="Calibri" w:hAnsi="Calibri"/>
+          <w:b w:val="0"/>
+          <w:color w:val="1F2937"/>
+          <w:sz w:val="19"/>
+        </w:rPr>
+        <w:t>• Engenharia &amp; Decisões Técnicas: Arquitetura em Next.js com foco em Core Web Vitals e renderização híbrida estática; SEO técnico estruturado com marcação Schema JSON-LD; instrumentação com Google Tag Manager (GTM) para rastreamento de funil (CRO) direto ao WhatsApp.</w:t>
+      </w:r>
+    </w:p>
+    <w:p>
+      <w:pPr>
+        <w:spacing w:after="80" w:line="276" w:lineRule="auto"/>
+        <w:jc w:val="left"/>
+      </w:pPr>
+      <w:r>
+        <w:rPr>
+          <w:rFonts w:ascii="Calibri" w:hAnsi="Calibri"/>
+          <w:b w:val="0"/>
+          <w:color w:val="1F2937"/>
+          <w:sz w:val="19"/>
+        </w:rPr>
+        <w:t>• Impacto: Carregamento instantâneo, topo das buscas orgânicas locais e aumento contínuo na captação de pacientes qualificados.</w:t>
+      </w:r>
+    </w:p>
+    <w:p>
+      <w:pPr>
+        <w:spacing w:after="40" w:line="276" w:lineRule="auto"/>
+        <w:jc w:val="left"/>
+      </w:pPr>
+      <w:r>
+        <w:rPr>
+          <w:rFonts w:ascii="Calibri" w:hAnsi="Calibri"/>
+          <w:b/>
+          <w:color w:val="1F2937"/>
+          <w:sz w:val="20"/>
+        </w:rPr>
+        <w:t>Ragnar AI-vs-AI Testing Suite — Plataforma de Auditoria Adversarial | github.com/Shuralot/TrackTest</w:t>
+      </w:r>
+    </w:p>
+    <w:p>
+      <w:pPr>
+        <w:spacing w:after="40" w:line="276" w:lineRule="auto"/>
+        <w:jc w:val="left"/>
+      </w:pPr>
+      <w:r>
+        <w:rPr>
+          <w:rFonts w:ascii="Calibri" w:hAnsi="Calibri"/>
+          <w:b w:val="0"/>
+          <w:color w:val="64748B"/>
+          <w:sz w:val="17"/>
+        </w:rPr>
+        <w:t>Stack: Next.js, TypeScript, PostgreSQL, Prisma ORM, Socket.IO, Evolution API, Docker</w:t>
+      </w:r>
+    </w:p>
+    <w:p>
+      <w:pPr>
+        <w:spacing w:after="40" w:line="276" w:lineRule="auto"/>
+        <w:jc w:val="left"/>
+      </w:pPr>
+      <w:r>
+        <w:rPr>
+          <w:rFonts w:ascii="Calibri" w:hAnsi="Calibri"/>
+          <w:b w:val="0"/>
+          <w:color w:val="1F2937"/>
+          <w:sz w:val="19"/>
+        </w:rPr>
+        <w:t>• Problema &amp; Solução: Plataforma para orquestrar e auditar testes de estresse e ataques adversariais entre modelos de IA via WhatsApp.</w:t>
+      </w:r>
+    </w:p>
+    <w:p>
+      <w:pPr>
+        <w:spacing w:after="40" w:line="276" w:lineRule="auto"/>
+        <w:jc w:val="left"/>
+      </w:pPr>
+      <w:r>
+        <w:rPr>
+          <w:rFonts w:ascii="Calibri" w:hAnsi="Calibri"/>
+          <w:b w:val="0"/>
+          <w:color w:val="1F2937"/>
+          <w:sz w:val="19"/>
+        </w:rPr>
+        <w:t>• Engenharia &amp; Decisões Técnicas: Aplicação full-stack em Next.js integrada ao PostgreSQL via Prisma ORM; automação de simulações com Evolution API; telemetria e streaming de logs em tempo real com Socket.IO; cálculo automatizado de pontuação de vulnerabilidade e consumo de tokens.</w:t>
+      </w:r>
+    </w:p>
+    <w:p>
+      <w:pPr>
+        <w:spacing w:after="120" w:line="276" w:lineRule="auto"/>
+        <w:jc w:val="left"/>
+      </w:pPr>
+      <w:r>
+        <w:rPr>
+          <w:rFonts w:ascii="Calibri" w:hAnsi="Calibri"/>
+          <w:b w:val="0"/>
+          <w:color w:val="1F2937"/>
+          <w:sz w:val="19"/>
+        </w:rPr>
+        <w:t>• Impacto: Automação da esteira de testes de IA, identificando falhas de segurança e alinhamento antes do deploy.</w:t>
+      </w:r>
+    </w:p>
+    <w:p>
+      <w:pPr>
+        <w:spacing w:after="60" w:line="276" w:lineRule="auto"/>
+        <w:jc w:val="left"/>
+      </w:pPr>
+      <w:r>
+        <w:rPr>
+          <w:rFonts w:ascii="Calibri" w:hAnsi="Calibri"/>
+          <w:b/>
+          <w:color w:val="3730A3"/>
+          <w:sz w:val="22"/>
         </w:rPr>
         <w:t>Experiência Profissional</w:t>
       </w:r>
     </w:p>
     <w:p>
       <w:pPr>
-        <w:keepNext/>
-        <w:spacing w:before="80" w:after="80"/>
+        <w:spacing w:after="40" w:line="276" w:lineRule="auto"/>
+        <w:jc w:val="left"/>
       </w:pPr>
       <w:r>
         <w:rPr>
-          <w:rFonts w:ascii="Arial" w:hAnsi="Arial"/>
+          <w:rFonts w:ascii="Calibri" w:hAnsi="Calibri"/>
           <w:b/>
-          <w:color w:val="1C1917"/>
-          <w:sz w:val="22"/>
+          <w:color w:val="1F2937"/>
+          <w:sz w:val="20"/>
         </w:rPr>
-        <w:t>Desenvolvedor Freelancer</w:t>
-      </w:r>
-      <w:r>
-        <w:rPr>
-          <w:rFonts w:ascii="Arial" w:hAnsi="Arial"/>
-          <w:color w:val="78716C"/>
-          <w:sz w:val="19"/>
-        </w:rPr>
-        <w:t xml:space="preserve">  |  Projetos Autônomos  |  Remoto</w:t>
-      </w:r>
-      <w:r>
-        <w:rPr>
-          <w:rFonts w:ascii="Arial" w:hAnsi="Arial"/>
-          <w:i/>
-          <w:color w:val="5B21B6"/>
-          <w:sz w:val="19"/>
-        </w:rPr>
-        <w:t xml:space="preserve"> (Jan de 2026 — Presente)</w:t>
+        <w:t>Desenvolvedor Freelancer | Projetos Autônomos | Remoto (Jan de 2026 — Presente)</w:t>
       </w:r>
     </w:p>
     <w:p>
       <w:pPr>
-        <w:pStyle w:val="ListBullet"/>
-        <w:spacing w:before="0" w:after="60"/>
+        <w:spacing w:after="80" w:line="276" w:lineRule="auto"/>
+        <w:jc w:val="left"/>
       </w:pPr>
       <w:r>
         <w:rPr>
-          <w:rFonts w:ascii="Arial" w:hAnsi="Arial"/>
-          <w:color w:val="44403C"/>
+          <w:rFonts w:ascii="Calibri" w:hAnsi="Calibri"/>
+          <w:b w:val="0"/>
+          <w:color w:val="1F2937"/>
           <w:sz w:val="19"/>
         </w:rPr>
-        <w:t>Desenvolvimento de soluções sob medida com foco em performance e SEO, entregando carregamento ágil e designs adaptáveis.</w:t>
+        <w:t>• Desenvolvimento de sistemas web sob medida com foco em performance, SEO técnico, interfaces responsivas e manutenibilidade.</w:t>
+        <w:br/>
+        <w:t>• Criação de robôs de web scraping para extração e estruturação de dados em automações comerciais.</w:t>
+        <w:br/>
+        <w:t>• Integração de gateways de pagamento, APIs e funis de conversão.</w:t>
       </w:r>
     </w:p>
     <w:p>
       <w:pPr>
-        <w:pStyle w:val="ListBullet"/>
-        <w:spacing w:before="0" w:after="60"/>
+        <w:spacing w:after="40" w:line="276" w:lineRule="auto"/>
+        <w:jc w:val="left"/>
       </w:pPr>
       <w:r>
         <w:rPr>
-          <w:rFonts w:ascii="Arial" w:hAnsi="Arial"/>
-          <w:color w:val="44403C"/>
-          <w:sz w:val="19"/>
+          <w:rFonts w:ascii="Calibri" w:hAnsi="Calibri"/>
+          <w:b/>
+          <w:color w:val="1F2937"/>
+          <w:sz w:val="20"/>
         </w:rPr>
-        <w:t>Criação de robôs de web scraping (extração de dados) para automação de processos comerciais.</w:t>
+        <w:t>Desenvolvedor Full Stack &amp; Implementador | AI Atende | Piedade, Jaboatão, PE (2025 — 2026)</w:t>
       </w:r>
     </w:p>
     <w:p>
       <w:pPr>
-        <w:pStyle w:val="ListBullet"/>
-        <w:spacing w:before="0" w:after="60"/>
+        <w:spacing w:after="120" w:line="276" w:lineRule="auto"/>
+        <w:jc w:val="left"/>
       </w:pPr>
       <w:r>
         <w:rPr>
-          <w:rFonts w:ascii="Arial" w:hAnsi="Arial"/>
-          <w:color w:val="44403C"/>
+          <w:rFonts w:ascii="Calibri" w:hAnsi="Calibri"/>
+          <w:b w:val="0"/>
+          <w:color w:val="1F2937"/>
           <w:sz w:val="19"/>
         </w:rPr>
-        <w:t>Integração de gateways de pagamento e plataformas de e-commerce personalizadas.</w:t>
+        <w:t>• Desenvolvimento full stack em JS/TSX para módulos de atendimento corporativo potencializados por IA.</w:t>
+        <w:br/>
+        <w:t>• Engenharia de prompts e design de interações humano-computador para fluxos conversacionais inteligentes.</w:t>
+        <w:br/>
+        <w:t>• Administração de servidores VPS e orquestração de microsserviços rodando em contêineres Docker.</w:t>
+        <w:br/>
+        <w:t>• Implementação e automação de fluxos no CRM Kommo, integrando mensageria e otimizando métricas de triagem.</w:t>
       </w:r>
     </w:p>
     <w:p>
       <w:pPr>
-        <w:pStyle w:val="ListBullet"/>
-        <w:spacing w:before="0" w:after="60"/>
+        <w:spacing w:after="60" w:line="276" w:lineRule="auto"/>
+        <w:jc w:val="left"/>
       </w:pPr>
       <w:r>
         <w:rPr>
-          <w:rFonts w:ascii="Arial" w:hAnsi="Arial"/>
-          <w:color w:val="44403C"/>
-          <w:sz w:val="19"/>
-        </w:rPr>
-        <w:t>Caso de Destaque (Website OdontoVieira): Desenvolvido em Next.js com foco em SEO local de alto impacto e rastreamento de conversão avançado via Google Tag Manager (GTM), gerando aumento direto na aquisição orgânica de pacientes.</w:t>
-      </w:r>
-    </w:p>
-    <w:p>
-      <w:pPr>
-        <w:keepNext/>
-        <w:spacing w:before="160" w:after="80"/>
-      </w:pPr>
-      <w:r>
-        <w:rPr>
-          <w:rFonts w:ascii="Arial" w:hAnsi="Arial"/>
+          <w:rFonts w:ascii="Calibri" w:hAnsi="Calibri"/>
           <w:b/>
-          <w:color w:val="1C1917"/>
+          <w:color w:val="3730A3"/>
           <w:sz w:val="22"/>
-        </w:rPr>
-        <w:t>Desenvolvedor Full Stack &amp; Implementador</w:t>
-      </w:r>
-      <w:r>
-        <w:rPr>
-          <w:rFonts w:ascii="Arial" w:hAnsi="Arial"/>
-          <w:color w:val="78716C"/>
-          <w:sz w:val="19"/>
-        </w:rPr>
-        <w:t xml:space="preserve">  |  AI Atende  |  Piedade, Jaboatão, PE (Presencial)</w:t>
-      </w:r>
-      <w:r>
-        <w:rPr>
-          <w:rFonts w:ascii="Arial" w:hAnsi="Arial"/>
-          <w:i/>
-          <w:color w:val="5B21B6"/>
-          <w:sz w:val="19"/>
-        </w:rPr>
-        <w:t xml:space="preserve"> (2025 — 2026)</w:t>
-      </w:r>
-    </w:p>
-    <w:p>
-      <w:pPr>
-        <w:pStyle w:val="ListBullet"/>
-        <w:spacing w:before="0" w:after="60"/>
-      </w:pPr>
-      <w:r>
-        <w:rPr>
-          <w:rFonts w:ascii="Arial" w:hAnsi="Arial"/>
-          <w:color w:val="44403C"/>
-          <w:sz w:val="19"/>
-        </w:rPr>
-        <w:t>Desenvolvimento de aplicações full stack em Javascript e TypeScript (JS/TSX) com foco em ferramentas de atendimento integradas com inteligência artificial.</w:t>
-      </w:r>
-    </w:p>
-    <w:p>
-      <w:pPr>
-        <w:pStyle w:val="ListBullet"/>
-        <w:spacing w:before="0" w:after="60"/>
-      </w:pPr>
-      <w:r>
-        <w:rPr>
-          <w:rFonts w:ascii="Arial" w:hAnsi="Arial"/>
-          <w:color w:val="44403C"/>
-          <w:sz w:val="19"/>
-        </w:rPr>
-        <w:t>Desenvolvimento de prompt engineering para fluxos automatizados conversacionais.</w:t>
-      </w:r>
-    </w:p>
-    <w:p>
-      <w:pPr>
-        <w:pStyle w:val="ListBullet"/>
-        <w:spacing w:before="0" w:after="60"/>
-      </w:pPr>
-      <w:r>
-        <w:rPr>
-          <w:rFonts w:ascii="Arial" w:hAnsi="Arial"/>
-          <w:color w:val="44403C"/>
-          <w:sz w:val="19"/>
-        </w:rPr>
-        <w:t>Gerenciamento de infraestrutura: provisionamento e configuração de servidores VPS e orquestração de microsserviços em contêineres Docker.</w:t>
-      </w:r>
-    </w:p>
-    <w:p>
-      <w:pPr>
-        <w:pStyle w:val="ListBullet"/>
-        <w:spacing w:before="0" w:after="60"/>
-      </w:pPr>
-      <w:r>
-        <w:rPr>
-          <w:rFonts w:ascii="Arial" w:hAnsi="Arial"/>
-          <w:color w:val="44403C"/>
-          <w:sz w:val="19"/>
-        </w:rPr>
-        <w:t>Implementação e automação de funis no CRM Kommo, integrando canais de mensagens e melhorando as métricas de resposta e triagem de clientes.</w:t>
-      </w:r>
-    </w:p>
-    <w:p>
-      <w:pPr>
-        <w:keepNext/>
-        <w:pBdr>
-          <w:bottom w:val="single" w:sz="6" w:space="4" w:color="E7E5E4"/>
-        </w:pBdr>
-        <w:spacing w:before="240" w:after="160"/>
-      </w:pPr>
-      <w:r>
-        <w:rPr>
-          <w:rFonts w:ascii="Arial" w:hAnsi="Arial"/>
-          <w:b/>
-          <w:color w:val="5B21B6"/>
-          <w:sz w:val="24"/>
         </w:rPr>
         <w:t>Formação Acadêmica</w:t>
       </w:r>
     </w:p>
     <w:p>
       <w:pPr>
-        <w:spacing w:before="0" w:after="80"/>
+        <w:spacing w:after="120" w:line="276" w:lineRule="auto"/>
+        <w:jc w:val="left"/>
       </w:pPr>
       <w:r>
         <w:rPr>
-          <w:rFonts w:ascii="Arial" w:hAnsi="Arial"/>
-          <w:b/>
-          <w:sz w:val="20"/>
-        </w:rPr>
-        <w:t>Especialização em DevOps</w:t>
-      </w:r>
-      <w:r>
-        <w:rPr>
-          <w:rFonts w:ascii="Arial" w:hAnsi="Arial"/>
-          <w:color w:val="44403C"/>
+          <w:rFonts w:ascii="Calibri" w:hAnsi="Calibri"/>
+          <w:b w:val="0"/>
+          <w:color w:val="1F2937"/>
           <w:sz w:val="19"/>
         </w:rPr>
-        <w:t xml:space="preserve">  |  CESAR School  |  Recife, PE</w:t>
-      </w:r>
-      <w:r>
-        <w:rPr>
-          <w:rFonts w:ascii="Arial" w:hAnsi="Arial"/>
-          <w:i/>
-          <w:color w:val="5B21B6"/>
-          <w:sz w:val="19"/>
-        </w:rPr>
-        <w:t xml:space="preserve">  (2025 — Março de 2027 (Em andamento))</w:t>
+        <w:t>• Especialização em DevOps — CESAR School | 2025 — 03/2027 (Em andamento)</w:t>
+        <w:br/>
+        <w:t>• Tecnólogo em Análise e Desenvolvimento de Sistemas — Uninassau | 2022 — 2025</w:t>
+        <w:br/>
+        <w:t>• Bacharelado em Psicologia — FACHO | 2018 — 2023</w:t>
       </w:r>
     </w:p>
     <w:p>
       <w:pPr>
-        <w:spacing w:before="0" w:after="80"/>
+        <w:spacing w:after="60" w:line="276" w:lineRule="auto"/>
+        <w:jc w:val="left"/>
       </w:pPr>
       <w:r>
         <w:rPr>
-          <w:rFonts w:ascii="Arial" w:hAnsi="Arial"/>
+          <w:rFonts w:ascii="Calibri" w:hAnsi="Calibri"/>
           <w:b/>
-          <w:sz w:val="20"/>
-        </w:rPr>
-        <w:t>Tecnologia em Análise e Desenvolvimento de Sistemas</w:t>
-      </w:r>
-      <w:r>
-        <w:rPr>
-          <w:rFonts w:ascii="Arial" w:hAnsi="Arial"/>
-          <w:color w:val="44403C"/>
-          <w:sz w:val="19"/>
-        </w:rPr>
-        <w:t xml:space="preserve">  |  Uninassau  |  Recife, PE</w:t>
-      </w:r>
-      <w:r>
-        <w:rPr>
-          <w:rFonts w:ascii="Arial" w:hAnsi="Arial"/>
-          <w:i/>
-          <w:color w:val="5B21B6"/>
-          <w:sz w:val="19"/>
-        </w:rPr>
-        <w:t xml:space="preserve">  (2022 — 2025)</w:t>
-      </w:r>
-    </w:p>
-    <w:p>
-      <w:pPr>
-        <w:spacing w:before="0" w:after="80"/>
-      </w:pPr>
-      <w:r>
-        <w:rPr>
-          <w:rFonts w:ascii="Arial" w:hAnsi="Arial"/>
-          <w:b/>
-          <w:sz w:val="20"/>
-        </w:rPr>
-        <w:t>Bacharelado em Psicologia</w:t>
-      </w:r>
-      <w:r>
-        <w:rPr>
-          <w:rFonts w:ascii="Arial" w:hAnsi="Arial"/>
-          <w:color w:val="44403C"/>
-          <w:sz w:val="19"/>
-        </w:rPr>
-        <w:t xml:space="preserve">  |  FACHO  |  Olinda, PE</w:t>
-      </w:r>
-      <w:r>
-        <w:rPr>
-          <w:rFonts w:ascii="Arial" w:hAnsi="Arial"/>
-          <w:i/>
-          <w:color w:val="5B21B6"/>
-          <w:sz w:val="19"/>
-        </w:rPr>
-        <w:t xml:space="preserve">  (2018 — 2023)</w:t>
-      </w:r>
-    </w:p>
-    <w:p>
-      <w:pPr>
-        <w:keepNext/>
-        <w:pBdr>
-          <w:bottom w:val="single" w:sz="6" w:space="4" w:color="E7E5E4"/>
-        </w:pBdr>
-        <w:spacing w:before="240" w:after="160"/>
-      </w:pPr>
-      <w:r>
-        <w:rPr>
-          <w:rFonts w:ascii="Arial" w:hAnsi="Arial"/>
-          <w:b/>
-          <w:color w:val="5B21B6"/>
-          <w:sz w:val="24"/>
+          <w:color w:val="3730A3"/>
+          <w:sz w:val="22"/>
         </w:rPr>
         <w:t>Certificações</w:t>
       </w:r>
     </w:p>
     <w:p>
       <w:pPr>
-        <w:pStyle w:val="ListBullet"/>
-        <w:spacing w:before="0" w:after="60"/>
+        <w:spacing w:after="40" w:line="276" w:lineRule="auto"/>
+        <w:jc w:val="left"/>
       </w:pPr>
       <w:r>
         <w:rPr>
-          <w:rFonts w:ascii="Arial" w:hAnsi="Arial"/>
-          <w:b/>
-          <w:color w:val="1C1917"/>
+          <w:rFonts w:ascii="Calibri" w:hAnsi="Calibri"/>
+          <w:b w:val="0"/>
+          <w:color w:val="1F2937"/>
           <w:sz w:val="19"/>
         </w:rPr>
-        <w:t xml:space="preserve">Red Hat System Administration I (RH-124 RHA) v10 ― </w:t>
-      </w:r>
-      <w:r>
-        <w:rPr>
-          <w:rFonts w:ascii="Arial" w:hAnsi="Arial"/>
-          <w:color w:val="44403C"/>
-          <w:sz w:val="19"/>
-        </w:rPr>
-        <w:t>Red Hat  |  Administração Linux corporativa avançada.</w:t>
-      </w:r>
-    </w:p>
-    <w:p>
-      <w:pPr>
-        <w:pStyle w:val="ListBullet"/>
-        <w:spacing w:before="0" w:after="60"/>
-      </w:pPr>
-      <w:r>
-        <w:rPr>
-          <w:rFonts w:ascii="Arial" w:hAnsi="Arial"/>
-          <w:b/>
-          <w:color w:val="1C1917"/>
-          <w:sz w:val="19"/>
-        </w:rPr>
-        <w:t xml:space="preserve">Programação Web ― </w:t>
-      </w:r>
-      <w:r>
-        <w:rPr>
-          <w:rFonts w:ascii="Arial" w:hAnsi="Arial"/>
-          <w:color w:val="44403C"/>
-          <w:sz w:val="19"/>
-        </w:rPr>
-        <w:t>SENAC  |  JavaScript, TypeScript, Angular, Node.js, Express, CRUD, SQL e Firebase.</w:t>
-      </w:r>
-    </w:p>
-    <w:p>
-      <w:pPr>
-        <w:pStyle w:val="ListBullet"/>
-        <w:spacing w:before="0" w:after="60"/>
-      </w:pPr>
-      <w:r>
-        <w:rPr>
-          <w:rFonts w:ascii="Arial" w:hAnsi="Arial"/>
-          <w:b/>
-          <w:color w:val="1C1917"/>
-          <w:sz w:val="19"/>
-        </w:rPr>
-        <w:t xml:space="preserve">Linguagem Python ― </w:t>
-      </w:r>
-      <w:r>
-        <w:rPr>
-          <w:rFonts w:ascii="Arial" w:hAnsi="Arial"/>
-          <w:color w:val="44403C"/>
-          <w:sz w:val="19"/>
-        </w:rPr>
-        <w:t>SENAC  |  Python Avançado, Django, PyQt6 Desktop, REST APIs e deploy no Railway.</w:t>
-      </w:r>
-    </w:p>
-    <w:p>
-      <w:pPr>
-        <w:pStyle w:val="ListBullet"/>
-        <w:spacing w:before="0" w:after="60"/>
-      </w:pPr>
-      <w:r>
-        <w:rPr>
-          <w:rFonts w:ascii="Arial" w:hAnsi="Arial"/>
-          <w:b/>
-          <w:color w:val="1C1917"/>
-          <w:sz w:val="19"/>
-        </w:rPr>
-        <w:t xml:space="preserve">Inglês para Conversação e Escrita Avançada ― </w:t>
-      </w:r>
-      <w:r>
-        <w:rPr>
-          <w:rFonts w:ascii="Arial" w:hAnsi="Arial"/>
-          <w:color w:val="44403C"/>
-          <w:sz w:val="19"/>
-        </w:rPr>
-        <w:t>SENAC  |  Fluência profissional e escrita técnica complexa.</w:t>
+        <w:t>• Red Hat System Administration I (RH-124 RHA) v10 — Red Hat (Administração Linux corporativa avançada).</w:t>
+        <w:br/>
+        <w:t>• Programação Web — SENAC (JavaScript, TypeScript, Angular, Node.js, Express, CRUD, SQL e Firebase).</w:t>
+        <w:br/>
+        <w:t>• Linguagem Python — SENAC (Python Avançado, Django, PyQt6 Desktop, REST APIs e deploy no Railway).</w:t>
+        <w:br/>
+        <w:t>• Inglês para Conversação e Escrita Avançada — SENAC (Fluência técnica profissional e comunicação internacional).</w:t>
       </w:r>
     </w:p>
     <w:sectPr>
       <w:pgSz w:w="12240" w:h="15840"/>
-      <w:pgMar w:top="1152" w:right="1152" w:bottom="1152" w:left="1152" w:header="720" w:footer="720" w:gutter="0"/>
+      <w:pgMar w:top="720" w:right="864" w:bottom="720" w:left="864" w:header="720" w:footer="720" w:gutter="0"/>
       <w:cols w:space="720"/>
       <w:docGrid w:linePitch="360"/>
     </w:sectPr>

</xml_diff>